<commit_message>
Fix local chat routing and refresh research deliverables
</commit_message>
<xml_diff>
--- a/output/blackbook/localmind-blackbook-60-pages.docx
+++ b/output/blackbook/localmind-blackbook-60-pages.docx
@@ -1291,7 +1291,7 @@
           <w:color w:val="000000"/>
           <w:sz w:val="24"/>
         </w:rPr>
-        <w:t>The locally applied repair passes 62 Linux tests and 99 tests in the Windows source copy on Linux, with six native Windows checks skipped. The replay reuses inspected questions and is not independent accuracy confirmation. The study demonstrates feasible local integration on a Ryzen 7 250 / RTX 5050 laptop while separating context delivery from remaining passage-selection and generation limits.</w:t>
+        <w:t xml:space="preserve">Latest checks pass 163 Linux tests and 200 tests for the Windows copy on Linux, with six native Windows checks skipped. Greetings bypass retrieval and inference; filename checks use indexed metadata, and source cards group repeated passages without renumbering citations. The historical replay reuses inspected questions and is not independent accuracy confirmation. Local integration is feasible on the Ryzen 7 250 / RTX 5050 laptop, while semantic correctness and broader reliability remain unestablished.</w:t>
       </w:r>
     </w:p>
     <w:p>
@@ -5654,7 +5654,7 @@
           <w:color w:val="000000"/>
           <w:sz w:val="24"/>
         </w:rPr>
-        <w:t>This updated report distinguishes three engineering stages: the historical evidence-delivery failure, a research-only diagnostic and the subsequently implemented production repair. Exact serialized-cost fitting is now applied to both local platform copies. A replay improves factual completion, but reused questions, passage-prefix losses and limited tool use prevent a general accuracy claim. The contribution remains inspectable local integration and reproducible evaluation rather than a new retrieval algorithm.</w:t>
+        <w:t xml:space="preserve">This report distinguishes the historical evidence-delivery failure, an evaluation-only diagnostic and a recorded production repair replay. Later implementation work isolates greetings, checks exact filenames through MCP and fits complete source records carrying document identities. The browser groups repeated passages without changing their citation numbers. These improvements support inspection and regression testing; they do not establish general answer accuracy or introduce a new retrieval algorithm.</w:t>
       </w:r>
     </w:p>
     <w:p>
@@ -5706,7 +5706,7 @@
           <w:color w:val="000000"/>
           <w:sz w:val="24"/>
         </w:rPr>
-        <w:t>The engineering problem includes both obtaining evidence and delivering it intact to the model. Historical LocalMind retrieval found the expected material, but approximate clipping discarded the evidence message after JSON serialization expanded it. The production repair addresses that failure through exact serialized UTF-8 accounting. Remaining challenges include selecting facts beyond short passage prefixes and verifying the relationships asserted in generated answers.</w:t>
+        <w:t xml:space="preserve">The engineering problem includes obtaining suitable evidence, identifying its exact source and delivering it intact to the model. Historical retrieval found expected material, but approximate clipping discarded the evidence message after JSON escaping expanded it. Exact serialized UTF-8 accounting repairs that failure. The current implementation also separates social turns and exact catalogue questions from generation, while retaining limits in evidence selection and semantic verification.</w:t>
       </w:r>
     </w:p>
     <w:p>
@@ -5758,7 +5758,7 @@
           <w:color w:val="000000"/>
           <w:sz w:val="24"/>
         </w:rPr>
-        <w:t>The system covers approved folders containing supported text, Markdown, code, DOCX text and PDFs with extractable text. It provides indexing, hybrid search, extraction viewing, source-linked chat, summaries, explicit memories, project workspaces and saved plans. The Windows edition supplies platform-specific setup and filesystem safeguards. Both local copies now contain the same repaired inference code; the repair is uncommitted and is identified by its source hash.</w:t>
+        <w:t xml:space="preserve">The system covers approved folders containing supported text, Markdown, code, DOCX text and PDFs with extractable text. It provides indexing, hybrid search, extraction viewing, source-linked chat, summaries, explicit memories, project workspaces and saved plans. The Windows edition supplies platform-specific setup and filesystem safeguards. Context and grounding repairs are already versioned; subsequent routing and display updates have separate regression records.</w:t>
       </w:r>
     </w:p>
     <w:p>
@@ -5809,7 +5809,7 @@
           <w:color w:val="000000"/>
           <w:sz w:val="24"/>
         </w:rPr>
-        <w:t>H1 predicts complete expected evidence within five results on the synthetic corpus; this holds for lexical and hybrid retrieval. H2 predicts reliable complete factual answers; the repair improves completion to 7/24 and 3/24, leaving H2 unsupported as a reliability claim. H3 predicts an adaptive MCP-agent benefit over single-pass RAG; no additional model-selected tool executes, and the replay provides no such benefit. These findings concern reused synthetic questions.</w:t>
+        <w:t xml:space="preserve">H1 predicts complete expected evidence within five results on the synthetic corpus; this holds historically for lexical and hybrid retrieval. H2 predicts reliable complete factual answers; the recorded repair replay reaches 7/24 and 3/24, leaving reliability unsupported. H3 predicts an adaptive MCP benefit; no additional model-selected tool executes in that replay. Later small model-selection probes reuse inspected examples and do not independently confirm these hypotheses.</w:t>
       </w:r>
     </w:p>
     <w:p>
@@ -5861,7 +5861,7 @@
           <w:color w:val="000000"/>
           <w:sz w:val="24"/>
         </w:rPr>
-        <w:t>The original experiment and its research diagnostic remain historical records. The repaired production code is verified separately through regression tests and a replay using the same question pairs. Passing these checks establishes the exercised mechanisms and bounded input retention. It does not prove complete answers, independent generalization or successful autonomous tool selection.</w:t>
+        <w:t xml:space="preserve">The original experiment, diagnostic and 64-request production repair replay remain distinct historical records. Later regression checks exercise greeting isolation, exact metadata lookup, source identity, citation bounds and forced final synthesis. Passing these checks establishes the mechanisms that were tested. It does not prove semantic entailment, complete answers on arbitrary documents or useful autonomous tool selection.</w:t>
       </w:r>
     </w:p>
     <w:p>
@@ -6322,7 +6322,7 @@
           <w:color w:val="000000"/>
           <w:sz w:val="24"/>
         </w:rPr>
-        <w:t>Chapter 5 separates the historical baseline, earlier diagnostic and new production replay. It reports unchanged retrieval measurements, repaired input retention, factual completion, historical summaries and platform validation. Chapter 6 records the completed repair and prioritizes remaining work. APA references and appendices preserve provenance, demonstration instructions and the status of required institutional attachments.</w:t>
+        <w:t xml:space="preserve">Chapter 5 preserves the historical baseline, diagnostic and production repair replay, then distinguishes later functional checks and the small model-selection probe. Retrieval, summary and resource measurements retain their original scope. Chapter 6 records completed fixes and remaining work. APA references and appendices preserve provenance, demonstration instructions and the status of institutional attachments.</w:t>
       </w:r>
     </w:p>
     <w:p>
@@ -6339,7 +6339,7 @@
           <w:color w:val="000000"/>
           <w:sz w:val="24"/>
         </w:rPr>
-        <w:t>The report retains 60 physical pages, including cover and preliminary material. Front matter uses Roman numbering; the technical body restarts at page 1. The companion IEEE paper and raw records provide additional detail. Historical commits and results remain identifiable, while the current local repair is recorded separately by SHA-256 rather than attributed to an older Git commit.</w:t>
+        <w:t xml:space="preserve">The report retains 60 physical pages, including cover and preliminary material. Front matter uses Roman numbering; the technical body restarts at page 1. The companion IEEE paper and raw records provide additional detail. Published context and grounding repairs, subsequent regression records and frozen experimental identities distinguish implementation versions without assigning new results to an older Git commit.</w:t>
       </w:r>
     </w:p>
     <w:p>
@@ -6580,7 +6580,7 @@
           <w:color w:val="000000"/>
           <w:sz w:val="24"/>
         </w:rPr>
-        <w:t>The implemented agent receives six read schemas for search, document reading, recall, document listing, project listing, and conversation lookup. Its loop permits at most four model/tool rounds and six additional tool executions after initial retrieval and recall. A final synthesis call can run with tools disabled. The host rejects requests outside its allowlist. These bounds make execution finite and keep generated requests from becoming arbitrary shell or filesystem operations.</w:t>
+        <w:t xml:space="preserve">The implemented agent receives seven read-only schemas, including exact filename lookup alongside search, reading, recall, document listing, project listing and conversation lookup. Ordinary generation permits four planning rounds and six additional tool executions after initial search and recall. A final synthesis disables tools and repacks original evidence; one citation-repair retry may follow. The host allowlist prevents these model requests from becoming arbitrary shell or filesystem actions.</w:t>
       </w:r>
     </w:p>
     <w:p>
@@ -6597,7 +6597,7 @@
           <w:color w:val="000000"/>
           <w:sz w:val="24"/>
         </w:rPr>
-        <w:t>An available tool is not evidence that the model used it effectively. Neither the historical runs nor the repaired production replay execute additional model-selected tools. The current agent therefore shows bounded protocol capability without an observed adaptive retrieval advantage. Tool schemas also consume prompt space. Exact-cost fitting now prevents the demonstrated avoidable evidence drop, but it cannot make short passage prefixes contain missing facts. Future experiments need tasks requiring further reads and must inspect whether those reads deliver the requested values. Successful protocol exchange, retained input and factual output remain distinct properties.</w:t>
+        <w:t xml:space="preserve">An available tool is not evidence that the model used it effectively. The historical runs and recorded repair replay execute no additional model-selected tools. Later changes improve routing, whole-record evidence fitting and reference validation without demonstrating an adaptive retrieval advantage. Valid citation numbers identify supplied records; they do not prove a claim follows from their text. Future experiments need tasks requiring additional reads and independent assessment of the resulting answers.</w:t>
       </w:r>
     </w:p>
     <w:p>
@@ -6873,7 +6873,7 @@
           <w:color w:val="000000"/>
           <w:sz w:val="24"/>
         </w:rPr>
-        <w:t>The engineering contribution now includes an applied exact serialized UTF-8 context repair alongside local serving, SQLite retrieval and complete-text pagination. The repair adds no learned retrieval or memory algorithm. Persistence still differs from useful recall, and source references still differ from supported claims (Packer et al., 2023; Es et al., 2024; Gao et al., 2023).</w:t>
+        <w:t xml:space="preserve">The engineering contribution includes exact serialized UTF-8 fitting, complete source records, local serving, SQLite retrieval and paginated extraction. Exact filename questions now use metadata tools rather than inference from search snippets. No learned retrieval or memory algorithm is introduced. Persistence still differs from useful recall, and valid source references differ from supported claims (Packer et al., 2023; Es et al., 2024; Gao et al., 2023).</w:t>
       </w:r>
     </w:p>
     <w:p>
@@ -6890,7 +6890,7 @@
           <w:color w:val="000000"/>
           <w:sz w:val="24"/>
         </w:rPr>
-        <w:t>The unchanged retrieval experiment covers all 96 questions within five lexical or hybrid results. Historically both generators completed 0/24 positives after evidence loss. The repaired production replay retains references for all 64 requests and reaches 7/24 single-pass and 3/24 agent AFVM, matching earlier diagnostic totals. Reused questions are not independent confirmation, and no additional model-selected tool executes. Prefix selection, summary retention, heterogeneous archives and semantic assessment remain open work. This positions LocalMind as a repaired, auditable prototype with measured limitations.</w:t>
+        <w:t xml:space="preserve">Historical lexical and hybrid retrieval cover all 96 questions within five results. Both original generators complete 0/24 positives after evidence loss. The separate repaired replay retains references for 64 requests and reaches 7/24 single-pass and 3/24 agent AFVM. Later functional regressions and model-selection probes address implementation defects but do not replace these frozen findings. Heterogeneous archives, summary retention and semantic assessment remain open work.</w:t>
       </w:r>
     </w:p>
     <w:p>
@@ -7373,7 +7373,7 @@
           <w:color w:val="000000"/>
           <w:sz w:val="24"/>
         </w:rPr>
-        <w:t>The measured Linux environment exposed approximately 14,768.9 MiB system memory and 8,151 MiB GPU memory. These operating system observations differ from marketed capacity because of reporting units and reservations. The evaluated chat model was Qwen3 4B in Q4_K_M format; EmbeddingGemma generated 768-dimensional document vectors. Model dimensions are metadata of this deployment rather than fixed assumptions in the storage layer.</w:t>
+        <w:t xml:space="preserve">The measured Linux environment exposed approximately 14,768.9 MiB system memory and 8,151 MiB GPU memory. Source defaults remain Qwen3 4B Q4_K_M with an 8,192 context setting. An optional tested profile uses Qwen3.5 9B Q4_K_M at 12,288 with partial CPU offload; it is not a universal sizing guarantee. EmbeddingGemma supplies 768-dimensional vectors in this deployment.</w:t>
       </w:r>
     </w:p>
     <w:p>
@@ -8253,7 +8253,7 @@
           <w:color w:val="000000"/>
           <w:sz w:val="24"/>
         </w:rPr>
-        <w:t>The assistant must retrieve local evidence before ordinary generated answers and provide an extractive mode when a usable chat model is unavailable. It may request additional read-only MCP tools within configured limits. Whole-document summarization must follow all stored extraction pages rather than substitute a few search hits. Project assistance must create an editable plan associated with a project, while keeping generated output inside the application data directory.</w:t>
+        <w:t xml:space="preserve">Complete greetings and capability-help turns use local responses without consulting documents, history or models. Exact filename and inventory questions use MCP metadata tools. Ordinary content questions retrieve evidence before generation and can fall back to exact excerpts. Additional read tools, whole-extraction summaries and editable project plans remain bounded application features. A greeting followed by a substantive request stays in the relevant document workflow.</w:t>
       </w:r>
     </w:p>
     <w:p>
@@ -8270,7 +8270,7 @@
           <w:color w:val="000000"/>
           <w:sz w:val="24"/>
         </w:rPr>
-        <w:t>These requirements have practical boundaries. Projects organize memories and conversations; they do not create separate filesystem permissions for each project. Planning writes one PLAN.md file and does not generate, compile or execute a software repository. Similarly, the implemented tool loop provides capability for additional retrieval, but the fresh benchmark observed no additional model-selected tool calls. Functional availability and demonstrated model behavior are reported separately.</w:t>
+        <w:t xml:space="preserve">Projects organize memories and conversations; they do not create separate filesystem permissions. Planning writes one PLAN.md rather than generating or executing a repository. Catalogue answers concern indexed approved sources, with counts and pagination; an absent match does not establish absence from the entire disk. Functional tool availability remains separate from effective model use and measured answer quality.</w:t>
       </w:r>
     </w:p>
     <w:p>
@@ -8356,7 +8356,7 @@
           <w:color w:val="000000"/>
           <w:sz w:val="24"/>
         </w:rPr>
-        <w:t>Usability requires understandable progress, source citations and editable memory rather than hidden state. Maintainability requires clear modules and repeatable tests. Security remains limited to a trusted local-user setting: the prototype has no application authentication, encrypted database or operating-system sandbox. Other local processes can access the same files or loopback service. These residual risks must be documented without treating local execution alone as complete security.</w:t>
+        <w:t xml:space="preserve">Usability requires inspectable sources and editable memory. Cards group passages by document identifier, falling back to exact paths; unidentified records stay separate. Every original reference number remains on its card, and a twelve-card display cap is disclosed. Security still assumes a trusted local user: there is no application authentication, encrypted database or operating-system sandbox. Local execution alone is not complete security.</w:t>
       </w:r>
     </w:p>
     <w:p>
@@ -8958,7 +8958,7 @@
           <w:color w:val="000000"/>
           <w:sz w:val="24"/>
         </w:rPr>
-        <w:t>The screenshot shows the isolated Lighthouse rehearsal, using only the two supplied example files. It is interface evidence rather than a replacement for the controlled accuracy experiment. A source card can be opened to verify a claim against the reader. The demonstration guide gives exact navigation and recovery steps.</w:t>
+        <w:t xml:space="preserve">The screenshot shows the earlier two-file Lighthouse rehearsal, not an accuracy test. Its model badge is historical. Current cards group repeated passages, retain every citation number and distinguish metadata-only file references from excerpts. Opening a card displays the corresponding indexed document. Source cards establish provenance, not semantic correctness.</w:t>
       </w:r>
     </w:p>
     <w:p>
@@ -9746,7 +9746,7 @@
           <w:color w:val="000000"/>
           <w:sz w:val="24"/>
         </w:rPr>
-        <w:t>Ten tools cover knowledge search, document listing and reading, explicit memory creation and recall, forgetting, project listing and creation, conversation search and approved-source listing. Two resources expose an overview and project information. Document reading takes an indexed identifier and a bounded offset and limit; it returns total length and a next offset. The default read is 12,000 characters and the maximum is 50,000 per call.</w:t>
+        <w:t xml:space="preserve">Eleven tools cover knowledge search, paginated document listing, exact filename lookup, extraction reading, memory creation and recall, forgetting, projects, conversations and approved roots. Two resources expose overview and project information. Listing and lookup return totals, offsets and next offsets. Lookup matches exact basenames or paths, preserves duplicate names and reports indexed scope. Extraction reads default to 12,000 characters and allow at most 50,000 per call.</w:t>
       </w:r>
     </w:p>
     <w:p>
@@ -9763,7 +9763,7 @@
           <w:color w:val="000000"/>
           <w:sz w:val="24"/>
         </w:rPr>
-        <w:t>The built-in agent receives only six read-only tool schemas. External MCP clients may access additional write tools, while the browser API can write memories directly. Tool annotations communicate intended behavior but do not act as authentication. Accordingly, the MCP boundary is a structured capability interface for a trusted local client. It is not an encrypted storage service or a permission system that makes arbitrary external clients trustworthy.</w:t>
+        <w:t xml:space="preserve">The built-in agent receives seven read-only schemas. External MCP clients may access additional write tools, and the browser can write memories directly. Tool annotations describe intent but are not authentication. Exact metadata responses keep filenames and paths from the store; generated text cannot rename a source. The MCP boundary is a capability interface for trusted local clients, not encrypted storage or permission to trust arbitrary clients.</w:t>
       </w:r>
     </w:p>
     <w:p>
@@ -9815,7 +9815,7 @@
           <w:color w:val="000000"/>
           <w:sz w:val="24"/>
         </w:rPr>
-        <w:t>For ordinary questions, the agent loads at most ten recent messages, then makes initial knowledge_search and recall calls. It retrieves five passages and selected project or global memories. Each initial passage is still cropped to its first thousand characters. The production context repair does not redesign this evidence-selection stage.</w:t>
+        <w:t xml:space="preserve">Complete social turns return locally before history, retrieval or model access. Exact inventory and filename requests use deterministic MCP metadata routes. Ordinary content questions use bounded recent context, initial knowledge_search and recall calls, five candidate passages and selected project or global memories. Earlier assistant claims are not reused as document evidence. Content requests mentioning a filename still reach the document workflow.</w:t>
       </w:r>
     </w:p>
     <w:p>
@@ -9832,7 +9832,7 @@
           <w:color w:val="000000"/>
           <w:sz w:val="24"/>
         </w:rPr>
-        <w:t>The two initial calls are outside the six-additional-tool budget. Ordinary turns permit at most eight actual MCP tool executions and five model calls: four planning calls plus one final synthesis. Summarization is a separate branch. Active-project recall and conversation search are scoped to that project; file retrieval remains across globally approved roots. Only the current user message can trigger the explicit remember command.</w:t>
+        <w:t xml:space="preserve">Ordinary generation exposes seven read-only schemas and allows at most eight actual MCP executions: two initial calls plus six additional tools. Four planning calls, one forced synthesis and at most one citation retry bound model calls at six. Forced synthesis removes tool schemas and repacks from original excerpts. Project recall and conversation search respect project scope; approved-file retrieval spans roots. Only the current user can trigger explicit remembering.</w:t>
       </w:r>
     </w:p>
     <w:p>
@@ -9849,7 +9849,7 @@
           <w:color w:val="000000"/>
           <w:sz w:val="24"/>
         </w:rPr>
-        <w:t>The repaired fitter uses budget B = C − min(1536, floor(C/3)) − 256, where C is context size. It accounts for serialized UTF-8 messages, metadata, tool schemas and shortening markers, pins the first system and latest user messages and finds the longest fitting complete-character prefix. Small remaining budgets are checked exactly. Tool-call metadata remains whole. This code is applied locally; the separate production replay retains initial references for all 64 requests within the configured bound.</w:t>
+        <w:t xml:space="preserve">For context setting C, the fitter uses B = C - min(1536, floor(C/3)) - 256 and exact serialized UTF-8 cost. Evidence packing retains whole numbered records containing text and source identity, using query-aware contiguous windows from 1,000 down to 60 characters. If an unusually long path cannot fit, that record is skipped while later candidates are tried. Displayed excerpts match delivered evidence; citation checks establish index syntax and bounds, not semantic entailment.</w:t>
       </w:r>
     </w:p>
     <w:p>
@@ -9987,7 +9987,7 @@
           <w:color w:val="000000"/>
           <w:sz w:val="24"/>
         </w:rPr>
-        <w:t>The privacy boundary includes approved folders, the database, application, MCP process and local model runtime. Loopback validation, disabled redirects, proxy avoidance and local-model checks reduce accidental remote inference. Source policy bounds reads, but the application assumes a trusted user and provides no API authentication, encrypted database, operating-system sandbox or comprehensive prompt-injection protection.</w:t>
+        <w:t xml:space="preserve">The privacy boundary includes approved folders, storage, API, MCP and the local runtime. Loopback validation, disabled redirects and proxy avoidance reduce accidental remote inference. A response guard checks cited references and can reject uncited actionable recommendations copied from untrusted evidence; bounded retry or exact excerpts provide recovery. These are limited controls. The application still lacks authentication, encrypted storage, an operating-system sandbox and comprehensive prompt-injection resistance.</w:t>
       </w:r>
     </w:p>
     <w:p>
@@ -10004,7 +10004,7 @@
           <w:color w:val="000000"/>
           <w:sz w:val="24"/>
         </w:rPr>
-        <w:t>Evaluation separates unchanged retrieval, historical generation, a research-only diagnostic and the current production repair replay. The corpus contains 39 Markdown documents and 141 chunks. Retrieval uses 96 answerable questions; generation reuses 24 selected positives and eight unknowns per method. The new replay verifies actual production code, reference retention and serialized-input bounds. Three historical summary tasks were not rerun for this repair.</w:t>
+        <w:t xml:space="preserve">Evaluation separates historical retrieval, original generation, a research-only diagnostic and the recorded production repair replay. The corpus contains 39 Markdown files and 141 chunks. Retrieval uses 96 positive questions; generation reuses 24 positives and eight unknowns per method. Later regression and model-selection records have distinct scopes. The historical summary and resource experiments were not rerun to establish current-model accuracy.</w:t>
       </w:r>
     </w:p>
     <w:p>
@@ -10021,7 +10021,7 @@
           <w:color w:val="000000"/>
           <w:sz w:val="24"/>
         </w:rPr>
-        <w:t>For CES@k, each expected fact needs at least one accepted alias in a retrieved chunk from its exact labeled source path among the first k results. AFVM requires every requested value in generated text; macro FVM averages fact coverage per positive question. These aliases do not prove semantic entailment. Current regression checks and the 64-request replay verify the repair, while reused questions and historical native Windows CI limit broader conclusions.</w:t>
+        <w:t xml:space="preserve">For CES@k, every expected fact needs an accepted alias in a retrieved chunk from its exact labeled source path among the first k results. AFVM requires all requested values in generated text; macro FVM averages positive-question coverage. Aliases and valid citation indices do not prove entailment. Latest functional checks pass 163 Linux and 200 Windows-copy tests on Linux, with six native checks skipped; the 64-request replay remains historical.</w:t>
       </w:r>
     </w:p>
     <w:p>
@@ -10107,7 +10107,7 @@
           <w:color w:val="000000"/>
           <w:sz w:val="24"/>
         </w:rPr>
-        <w:t>Three conditions must be distinguished. The original production snapshot lost evidence and completed no positive answers. A subsequent research-only exact-fit diagnostic tested the proposed mechanism. The current production repair is verified through a new 64-request replay without fitter substitution. The same corpus and question pairs are reused; improvement is development evidence, not held-out confirmation.</w:t>
+        <w:t xml:space="preserve">Three historical conditions remain distinct: the original snapshot loses evidence, an evaluation-only diagnostic tests the mechanism, and the recorded production repair replay verifies actual fitting without substitution. They reuse the same corpus and questions. Later routing, reference-identity and display changes have separate functional checks. Neither those checks nor a small postselected 9B probe replace the original measurements with held-out accuracy evidence.</w:t>
       </w:r>
     </w:p>
     <w:p>
@@ -10834,7 +10834,7 @@
           <w:color w:val="000000"/>
           <w:sz w:val="24"/>
         </w:rPr>
-        <w:t>The 24 positives are clustered within synthetic project families and do not establish an arbitrary-drive population failure rate. The relevant engineering result is narrower: the original evidence-delivery implementation failed on this sample. The current replay reported next uses separately recorded repaired production code.</w:t>
+        <w:t xml:space="preserve">The 24 positives are clustered within synthetic project families and do not establish a population failure rate for arbitrary drives. The engineering observation is narrower: the original evidence-delivery implementation failed on this sample. The separately recorded repair replay uses changed production code; later model-selection and regression results must retain their own scope.</w:t>
       </w:r>
     </w:p>
     <w:p>
@@ -10886,7 +10886,7 @@
           <w:color w:val="000000"/>
           <w:sz w:val="24"/>
         </w:rPr>
-        <w:t>The production repair now finds the longest complete-character prefix that fits the actual serialized UTF-8 message cost. Accounting includes JSON escaping, metadata, the shortening marker and tool schemas, while preserving pinned system and current-user messages. It removes fixed small-budget rejection heuristics and keeps tool-call metadata whole. All 64 production replay requests retain initial reference input and satisfy the configured serialized-input bound.</w:t>
+        <w:t xml:space="preserve">The production fitter finds a complete-character prefix within actual serialized UTF-8 cost, accounting for escaping, metadata, shortening markers and schemas while pinning the system and current-user messages. The historical 64-request repair replay retained initial reference input within bounds. Later whole-record packing carries document identity and query-aware excerpts together. That later selection policy has not been evaluated by rerunning the frozen retrieval or summary experiment.</w:t>
       </w:r>
     </w:p>
     <w:p>
@@ -10988,7 +10988,7 @@
           <w:color w:val="000000"/>
           <w:sz w:val="24"/>
         </w:rPr>
-        <w:t>The new replay exercises actual repaired production code with real MCP calls and no diagnostic fitter substitution. Both methods answer the same 24 positives and eight unknowns used earlier. All 64 requests retain initial reference evidence, remain within the configured serialized-input bound and complete without request errors.</w:t>
+        <w:t xml:space="preserve">The recorded repair replay exercises actual production fitting with real MCP calls and no diagnostic substitution. Both methods answer the same earlier 24 positives and eight unknowns. All 64 requests retain initial reference evidence, stay within the configured bound and finish without request errors. These are historical development observations using the 4B configuration, not results of the optional later 9B profile.</w:t>
       </w:r>
     </w:p>
     <w:p>
@@ -11393,7 +11393,7 @@
           <w:color w:val="000000"/>
           <w:sz w:val="24"/>
         </w:rPr>
-        <w:t>Macro FVM averages fact coverage per positive question. The earlier research-only diagnostic also produced 7/24 and 3/24; those records remain historical and separate. Matching totals do not make this replay independent confirmation. The production repair is local and uncommitted, with both platform copies identified by the same source SHA-256.</w:t>
+        <w:t xml:space="preserve">Macro FVM averages fact coverage per positive question. The earlier diagnostic also produced 7/24 and 3/24; matching totals are not independent confirmation. Context and grounding repairs are now published in versioned branches. The original replay and source hashes remain frozen, while later greeting, catalogue and citation changes have separate checks. A release state must not be inferred from the old experiment alone.</w:t>
       </w:r>
     </w:p>
     <w:p>
@@ -11410,7 +11410,7 @@
           <w:color w:val="000000"/>
           <w:sz w:val="24"/>
         </w:rPr>
-        <w:t>The repaired single-pass method uses the abstention phrase on 8/8 unknowns; the agent does so on 7/8. Each response uses one model call, and neither method executes an additional model-selected tool. Limited prefix coverage and semantic mistakes remain; the results establish improved evidence delivery without demonstrating general reliability or an adaptive agent advantage.</w:t>
+        <w:t xml:space="preserve">In this historical replay, single-pass RAG uses the abstention phrase on 8/8 unknowns and the agent on 7/8. Each response uses one model call; neither method executes an additional model-selected tool. Current citation retries therefore cannot be credited for those earlier outcomes. Prefix coverage and semantic mistakes limit this evidence; it establishes improved delivery without demonstrating general reliability or agent advantage.</w:t>
       </w:r>
     </w:p>
     <w:p>
@@ -11902,7 +11902,7 @@
           <w:color w:val="000000"/>
           <w:sz w:val="24"/>
         </w:rPr>
-        <w:t>Current Linux validation passes 62 tests. The Windows checkout tested on Linux passes 99, with six native Windows checks skipped. These are not new native Windows results. Historical CI on Windows Server 2025 passed 86 tests per interpreter on Python 3.12.10 and 3.13.15 using fake Ollama; actual Windows 11 GPU inference remains unverified.</w:t>
+        <w:t xml:space="preserve">Latest Linux validation passes 163 tests. The Windows copy tested on Linux passes 200, with six native checks skipped. Historical Windows Server 2025 CI passed 86 cases per interpreter on Python 3.12.10 and 3.13.15 with a fake runtime. Those older native checks do not validate the latest changes or establish Windows 11 GPU inference performance.</w:t>
       </w:r>
     </w:p>
     <w:p>
@@ -11919,7 +11919,7 @@
           <w:color w:val="000000"/>
           <w:sz w:val="24"/>
         </w:rPr>
-        <w:t>Nineteen new regression cases cover escaping, Unicode, exact boundaries, tiny budgets, input immutability, tool metadata and outgoing payloads. Fourteen of the initial fifteen cases failed before repair. Independent review also exercised 3,000 deterministic randomized budget cases. Both local platform copies contain identical repaired inference code and regression tests.</w:t>
+        <w:t xml:space="preserve">The latest regressions exercise greeting isolation, exact file metadata, source identity, grouped passages, imperative-language checks, forced final repacking and oversized-path omission. Earlier 62/99 repair-test counts remain dated snapshots. One live hello took 0.0931 seconds; three follow-ups took 0.0305, 0.0314 and 0.0672 seconds. These local-route observations exclude model inference and are not general chatbot latency measurements.</w:t>
       </w:r>
     </w:p>
     <w:p>
@@ -12217,7 +12217,7 @@
           <w:color w:val="000000"/>
           <w:sz w:val="24"/>
         </w:rPr>
-        <w:t>The new replay median response times are 0.686 seconds for single-pass and 1.237 seconds for MCP. They concern reused questions and mixed successful or incomplete outputs, not a controlled speed comparison. Historical resource peaks above were not remeasured for this repair. Energy use, archive scale and broader hardware performance remain unestablished.</w:t>
+        <w:t xml:space="preserve">The historical repair replay median response times were 0.686 seconds for single-pass and 1.237 seconds for MCP. They mix complete and incomplete outputs on reused questions and are not a controlled speed comparison. The resource peaks above were not remeasured for later fixes or model selection. Energy use, archive scale and broader hardware performance remain unestablished.</w:t>
       </w:r>
     </w:p>
     <w:p>
@@ -12269,7 +12269,7 @@
           <w:color w:val="000000"/>
           <w:sz w:val="24"/>
         </w:rPr>
-        <w:t>Internal validity is limited by reused questions, different schema overheads and unseeded generation at temperature 0.25. The production replay follows an observed failure and prior diagnostic on the same examples. It verifies execution of the applied repair without fitter substitution, but it is not held-out confirmation or a randomized comparison of reasoning ability.</w:t>
+        <w:t xml:space="preserve">Internal validity is limited by reused questions, schema overhead and unseeded generation at temperature 0.25. The recorded production replay follows an observed failure and diagnostic on the same examples. Later query-aware packing and citation retries change the implementation again. These development stages need distinct records and cannot be pooled as an independent comparison of model reasoning.</w:t>
       </w:r>
     </w:p>
     <w:p>
@@ -12286,7 +12286,7 @@
           <w:color w:val="000000"/>
           <w:sz w:val="24"/>
         </w:rPr>
-        <w:t>External validity remains narrow: 39 synthetic English Markdown files are not a representative hard drive. No new OCR, multilingual, adversarial, multi-user, longitudinal-memory or Windows 11 GPU study accompanies the repair. Historical summary and resource measurements were not repeated during the question-answer replay.</w:t>
+        <w:t xml:space="preserve">The later optional 9B/12,288 profile produced 8/8 generated literal matches and 2/2 exact unknown abstentions on a five-document development probe. Context, instructions and citation retry also changed, so this is a postselected configuration result, not model-only or paper accuracy. All four compared runs failed the complete short-summary check. No held-out corpus or native Windows GPU study accompanies that probe.</w:t>
       </w:r>
     </w:p>
     <w:p>
@@ -12303,7 +12303,7 @@
           <w:color w:val="000000"/>
           <w:sz w:val="24"/>
         </w:rPr>
-        <w:t>The strongest supported conclusion is that exact serialization prevents the observed avoidable evidence drop in the tested requests. Sixty-four retained reference messages do not imply 64 correct answers or universally complete context. Frozen baseline records, separate production outputs and source hashes preserve the distinction between original failure, diagnostic development and current local code.</w:t>
+        <w:t xml:space="preserve">Exact serialization prevents the observed avoidable evidence drop in the exercised requests. Sixty-four retained references do not imply 64 correct answers. Frozen raw outputs, distinct run identities and versioned source records separate historical failure, diagnostic development, the repair replay and later application changes. Semantic correctness, adversarial robustness and performance on representative personal libraries still require independent evidence.</w:t>
       </w:r>
     </w:p>
     <w:p>
@@ -12372,7 +12372,7 @@
           <w:color w:val="000000"/>
           <w:sz w:val="24"/>
         </w:rPr>
-        <w:t>LocalMind integrates approved-file indexing, source inspection, persistent SQLite memory, project workspaces, local inference and a genuine MCP service. The current Linux and Windows copies include an exact serialized UTF-8 context-fitting repair. The code is applied locally and verified by source hash; it has not been committed or pushed into the historical Git references.</w:t>
+        <w:t xml:space="preserve">LocalMind integrates approved-file indexing, source inspection, persistent SQLite memory, local inference and genuine MCP communication. Published context and grounding repairs are followed by tested greeting isolation, exact metadata routes and whole-record evidence identity. Source cards group repeated passages while preserving reference numbers. The result is an inspectable local workflow, with bounded actions and explicit limits rather than guaranteed factual assistance.</w:t>
       </w:r>
     </w:p>
     <w:p>
@@ -12389,7 +12389,7 @@
           <w:color w:val="000000"/>
           <w:sz w:val="24"/>
         </w:rPr>
-        <w:t>The original generation baseline completed 0/24 positives per method after dropping evidence. The current production replay retains references for 64/64 requests, respects the configured input bound and reports no errors. Single-pass AFVM is 7/24 with macro FVM 37.50%; MCP-agent AFVM is 3/24 with macro FVM 27.08%. These totals match the earlier research-only diagnostic but come from actual repaired production code.</w:t>
+        <w:t xml:space="preserve">Historically, the original generators completed 0/24 positives per method after dropping evidence. A separate repaired replay retains references in 64/64 requests without errors. Single-pass AFVM is 7/24 with macro FVM 37.50%; agent AFVM is 3/24 with macro FVM 27.08%. These reused-question observations remain unchanged. The later 9B selection probe and latest functional checks have separate records and do not replace the manuscript experiment.</w:t>
       </w:r>
     </w:p>
     <w:p>
@@ -12406,7 +12406,7 @@
           <w:color w:val="000000"/>
           <w:sz w:val="24"/>
         </w:rPr>
-        <w:t>The repair completes one necessary engineering correction without establishing dependable factual assistance. Passage-prefix losses remain, no additional model-selected tool executes and the reused corpus is not independent confirmation. The earlier summary experiment retained only 10/24 requested facts and was not rerun here. Local ownership and functional integration are demonstrated; broader factual reliability, stronger evidence selection and adversarial security remain open work.</w:t>
+        <w:t xml:space="preserve">Latest checks pass 163 Linux and 200 Windows-copy tests on Linux, with six native skips. The optional 9B development configuration reaches 8/8 known literal checks and 2/2 unknown abstentions after selection; this is not general accuracy. Historical summaries retain only 10/24 values. Citation bounds do not establish entailment, and broader factual reliability, representative-library evaluation and native Windows GPU validation remain open work.</w:t>
       </w:r>
     </w:p>
     <w:p>
@@ -12441,7 +12441,7 @@
           <w:color w:val="000000"/>
           <w:sz w:val="24"/>
         </w:rPr>
-        <w:t>Exact serialized-cost fitting is now implemented and regression-tested in both local platform copies. Future context work should preserve per-source evidence quotas, expose the precise references sent to the model and handle requested facts beyond the first 1,000 characters. These are additional improvements, not descriptions of the completed repair. A held-out corpus is needed before claiming general factual reliability.</w:t>
+        <w:t xml:space="preserve">Exact serialized fitting, whole-record evidence identity, local social responses and exact catalogue routing are implemented. Further context work should test field-aware selection and preserve useful coverage when candidate windows shrink or a record cannot fit. Source cards show delivered references but cannot prove their semantic use. A held-out corpus is needed before claiming general factual reliability.</w:t>
       </w:r>
     </w:p>
     <w:p>
@@ -12458,7 +12458,7 @@
           <w:color w:val="000000"/>
           <w:sz w:val="24"/>
         </w:rPr>
-        <w:t>Task-aware evidence selection remains a priority. Offset-aware retrieval can seek requested fields instead of relying on passage beginnings. Structured extraction and source-linked verification can reduce losses during summary merging. Comparisons of models and agent policies should hold evidence budgets constant, include tasks requiring additional reads and report whether model-selected tools actually retrieve missing facts.</w:t>
+        <w:t xml:space="preserve">Task-aware evidence selection remains a priority. Query-aware windows now improve selection within returned passages, but relevant material can still lie outside retrieved chunks or bounded windows. Structured extraction and source-linked checks may reduce summary losses. Fair model comparisons should hold context, instructions and retry policy constant, include tasks requiring further reads, and report whether additional tools deliver missing facts.</w:t>
       </w:r>
     </w:p>
     <w:p>
@@ -12475,7 +12475,7 @@
           <w:color w:val="000000"/>
           <w:sz w:val="24"/>
         </w:rPr>
-        <w:t>Operational improvements include optional local OCR, opt-in file watching, content-hash freshness, memory export and import, encrypted storage and systematic prompt-injection tests. The tested local repair also needs a versioned commit and fresh native Windows validation before old CI evidence can be attributed to the changed code.</w:t>
+        <w:t xml:space="preserve">Operational improvements include optional local OCR, opt-in watching, content-hash freshness, memory export and import, encrypted storage and systematic prompt-injection tests. Versioned context and grounding repairs are already published. Source changes require fresh native Windows validation; historical CI and Linux execution of the Windows copy cannot substitute for checks of changed code.</w:t>
       </w:r>
     </w:p>
     <w:p>
@@ -12492,7 +12492,7 @@
           <w:color w:val="000000"/>
           <w:sz w:val="24"/>
         </w:rPr>
-        <w:t>Real Windows 11 GPU runs, heterogeneous and multilingual files, larger archives and consented user studies remain necessary. Future evaluation should measure cold starts, power and human verification effort. These activities are proposed work, distinct from the completed production context repair and its limited replay.</w:t>
+        <w:t xml:space="preserve">Real Windows 11 GPU runs, heterogeneous and multilingual files, larger archives and consented user studies remain necessary. Future experiments should distinguish model loading from warm execution and measure power and human verification effort. These proposed activities are separate from completed local routing, identity and context fixes, their regression checks and the limited synthetic development probe.</w:t>
       </w:r>
     </w:p>
     <w:p>
@@ -13777,7 +13777,7 @@
           <w:color w:val="000000"/>
           <w:sz w:val="24"/>
         </w:rPr>
-        <w:t>The archive preserves the frozen corpus, baseline and diagnostic. The separate production replay is recorded under research/evaluation/results/2026-10-17-production-context-fix-v1/. Verification files in output/verification identify actual production fitting and real MCP calls on the same 32 questions per method.</w:t>
+        <w:t xml:space="preserve">Frozen corpus, baseline, diagnostic and production repair replay remain under research/evaluation. The replay is 2026-10-17-production-context-fix-v1. Later model-selection records are in research/model-selection. Protocols, raw responses, hashes and verification records keep these development stages separate.</w:t>
       </w:r>
     </w:p>
     <w:p>
@@ -13794,7 +13794,7 @@
           <w:color w:val="000000"/>
           <w:sz w:val="24"/>
         </w:rPr>
-        <w:t>Historical Linux commit ddbbbb7 and Windows commit 0e0bbf6 precede the local uncommitted repair. Both repaired copies of copilot/ollama.py have SHA-256: 1db1e79b7eac3dba77b2afaa2e852db847b7ae2169d7f92327b750dbaa4cdc25. Full commit identifiers and regression records accompany the archive.</w:t>
+        <w:t xml:space="preserve">Published repair anchors are main 4a3533a and Windows b377ac6. Historical experiments use ddbbbb7 and 0e0bbf6. The replay fitter SHA-256 remains 1db1e79b7eac3dba77b2afaa2e852db847b7ae2169d7f92327b750dbaa4cdc25. New routing and display changes retain separate source records.</w:t>
       </w:r>
     </w:p>
     <w:p>
@@ -13811,7 +13811,7 @@
           <w:color w:val="000000"/>
           <w:sz w:val="22"/>
         </w:rPr>
-        <w:t>Table A.1 Reproduction settings</w:t>
+        <w:t xml:space="preserve">Table A.1 Historical reproduction settings</w:t>
       </w:r>
     </w:p>
     <w:tbl>
@@ -14139,7 +14139,7 @@
           <w:color w:val="000000"/>
           <w:sz w:val="24"/>
         </w:rPr>
-        <w:t>Preserve model digests, labels and source hashes; use a new run directory for changes. Restart to load the repair; no model change or reindexing is required. Historical Windows CI run 37470160711 applies to its original commit.</w:t>
+        <w:t xml:space="preserve">The table records the historical 4B experiment. Source defaults remain 4B/8,192; optional 9B/12,288 has separate probe records. Use new run IDs and preserve hashes. Native Windows CI run 37470160711 applies to its historical commit.</w:t>
       </w:r>
     </w:p>
     <w:p>
@@ -14536,7 +14536,7 @@
           <w:color w:val="000000"/>
           <w:sz w:val="24"/>
         </w:rPr>
-        <w:t>The normal presentation launcher remains unchanged. Restart any application process left running before the context repair so it imports the corrected code. Verify every answer against the reader, and label any saved screenshot or output as rehearsal evidence. A two-minute live segment should show a few inspectable operations rather than attempt to index an entire drive.</w:t>
+        <w:t xml:space="preserve">The normal and demo apps share one local model service while retaining separate data directories. Live metadata checks found seven indexed files, one exact api.md match and no match for an absent filename; these are indexed-scope observations, not a drive search. Complete greetings use no retrieval or inference. Label saved outputs as rehearsal evidence and verify answers against the reader during the short live demonstration.</w:t>
       </w:r>
     </w:p>
     <w:p>
@@ -15122,7 +15122,7 @@
                 <w:color w:val="000000"/>
                 <w:sz w:val="22"/>
               </w:rPr>
-              <w:t>Historical commits plus current local repair SHA-256</w:t>
+              <w:t>Versioned source and dated verification records</w:t>
             </w:r>
           </w:p>
         </w:tc>
@@ -15330,7 +15330,7 @@
           <w:color w:val="000000"/>
           <w:sz w:val="24"/>
         </w:rPr>
-        <w:t>This updated report separates the historical baseline, earlier diagnostic and current local production repair. The new replay and exact source hashes accompany the archive; the repair remains uncommitted. Future changes must retain their own version and verification records so that prior findings remain reproducible.</w:t>
+        <w:t xml:space="preserve">This report separates the frozen baseline, diagnostic, recorded repair replay and later implementation checks. The earlier repairs are published; latest source and document refreshes retain their own release records. Preserve prior archives and checksums as historical evidence rather than rewriting them to match current behavior. Re-render later edits and verify the required sixty-page layout before submission.</w:t>
       </w:r>
     </w:p>
     <w:sectPr>

</xml_diff>